<commit_message>
feat: update script versions in employee report and enhance note editing functionality
</commit_message>
<xml_diff>
--- a/templates/shop_templete.docx
+++ b/templates/shop_templete.docx
@@ -68,6 +68,7 @@
               </w:rPr>
               <w:t>{{</w:t>
             </w:r>
+            <w:proofErr w:type="spellStart"/>
             <w:proofErr w:type="gramEnd"/>
             <w:r>
               <w:rPr>
@@ -75,7 +76,16 @@
                 <w:sz w:val="22"/>
                 <w:szCs w:val="22"/>
               </w:rPr>
-              <w:t>cus}}</w:t>
+              <w:t>cus</w:t>
+            </w:r>
+            <w:proofErr w:type="spellEnd"/>
+            <w:r>
+              <w:rPr>
+                <w:b/>
+                <w:sz w:val="22"/>
+                <w:szCs w:val="22"/>
+              </w:rPr>
+              <w:t>}}</w:t>
             </w:r>
           </w:p>
         </w:tc>
@@ -224,7 +234,23 @@
                 <w:sz w:val="22"/>
                 <w:szCs w:val="22"/>
               </w:rPr>
-              <w:t xml:space="preserve">Eddy Chainamnaris  </w:t>
+              <w:t xml:space="preserve">Eddy </w:t>
+            </w:r>
+            <w:proofErr w:type="spellStart"/>
+            <w:r>
+              <w:rPr>
+                <w:sz w:val="22"/>
+                <w:szCs w:val="22"/>
+              </w:rPr>
+              <w:t>Chainamnaris</w:t>
+            </w:r>
+            <w:proofErr w:type="spellEnd"/>
+            <w:r>
+              <w:rPr>
+                <w:sz w:val="22"/>
+                <w:szCs w:val="22"/>
+              </w:rPr>
+              <w:t xml:space="preserve">  </w:t>
             </w:r>
           </w:p>
         </w:tc>
@@ -340,13 +366,22 @@
               </w:rPr>
               <w:t>: {{</w:t>
             </w:r>
+            <w:proofErr w:type="spellStart"/>
             <w:proofErr w:type="gramEnd"/>
             <w:r>
               <w:rPr>
                 <w:sz w:val="22"/>
                 <w:szCs w:val="22"/>
               </w:rPr>
-              <w:t>part_name}}</w:t>
+              <w:t>part_name</w:t>
+            </w:r>
+            <w:proofErr w:type="spellEnd"/>
+            <w:r>
+              <w:rPr>
+                <w:sz w:val="22"/>
+                <w:szCs w:val="22"/>
+              </w:rPr>
+              <w:t>}}</w:t>
             </w:r>
           </w:p>
         </w:tc>
@@ -513,13 +548,22 @@
               </w:rPr>
               <w:t>{{</w:t>
             </w:r>
+            <w:proofErr w:type="spellStart"/>
             <w:proofErr w:type="gramEnd"/>
             <w:r>
               <w:rPr>
                 <w:sz w:val="22"/>
                 <w:szCs w:val="22"/>
               </w:rPr>
-              <w:t>material_detail}}</w:t>
+              <w:t>material_detail</w:t>
+            </w:r>
+            <w:proofErr w:type="spellEnd"/>
+            <w:r>
+              <w:rPr>
+                <w:sz w:val="22"/>
+                <w:szCs w:val="22"/>
+              </w:rPr>
+              <w:t>}}</w:t>
             </w:r>
           </w:p>
         </w:tc>
@@ -1715,17 +1759,6 @@
           </w:p>
           <w:p>
             <w:pPr>
-              <w:pStyle w:val="BodyText"/>
-              <w:spacing w:line="240" w:lineRule="atLeast"/>
-              <w:rPr>
-                <w:b w:val="0"/>
-                <w:sz w:val="18"/>
-                <w:szCs w:val="18"/>
-              </w:rPr>
-            </w:pPr>
-          </w:p>
-          <w:p>
-            <w:pPr>
               <w:rPr>
                 <w:sz w:val="18"/>
                 <w:szCs w:val="18"/>
@@ -1795,14 +1828,6 @@
               </w:rPr>
               <w:t>PCS.</w:t>
             </w:r>
-          </w:p>
-          <w:p>
-            <w:pPr>
-              <w:rPr>
-                <w:sz w:val="18"/>
-                <w:szCs w:val="18"/>
-              </w:rPr>
-            </w:pPr>
           </w:p>
         </w:tc>
       </w:tr>
@@ -1836,7 +1861,7 @@
       <w:headerReference w:type="default" r:id="rId8"/>
       <w:footerReference w:type="default" r:id="rId9"/>
       <w:pgSz w:w="15840" w:h="12240" w:orient="landscape"/>
-      <w:pgMar w:top="432" w:right="720" w:bottom="720" w:left="720" w:header="720" w:footer="259" w:gutter="0"/>
+      <w:pgMar w:top="270" w:right="720" w:bottom="360" w:left="720" w:header="720" w:footer="259" w:gutter="0"/>
       <w:cols w:space="720"/>
       <w:docGrid w:linePitch="360"/>
     </w:sectPr>
@@ -2877,6 +2902,7 @@
   <w:style w:type="character" w:default="1" w:styleId="DefaultParagraphFont">
     <w:name w:val="Default Paragraph Font"/>
     <w:uiPriority w:val="1"/>
+    <w:semiHidden/>
     <w:unhideWhenUsed/>
   </w:style>
   <w:style w:type="table" w:default="1" w:styleId="TableNormal">

</xml_diff>